<commit_message>
Bo Tieu chuan nganh cu (22TCN), bo sung 23 Tieu chuan co so (TCCS .../TCDBVN) va cap nhat bieu mau
</commit_message>
<xml_diff>
--- a/03_ThuVien_BieuMau_Chuan/01_Mau_PhapLy_NhiemVu_PhuongAnKS/01_Mau_NhiemVu_KhaoSat_XayDung_CauDuong.docx
+++ b/03_ThuVien_BieuMau_Chuan/01_Mau_PhapLy_NhiemVu_PhuongAnKS/01_Mau_NhiemVu_KhaoSat_XayDung_CauDuong.docx
@@ -348,7 +348,7 @@
         <w:ind w:left="425"/>
       </w:pPr>
       <w:r>
-        <w:t>- 22TCN 263-2000 - Quy trình khảo sát đường ô tô;</w:t>
+        <w:t>- TCCS 31:2020/TCĐBVN - Đường ô tô - Tiêu chuẩn khảo sát;</w:t>
       </w:r>
     </w:p>
     <w:p>
@@ -357,7 +357,7 @@
         <w:ind w:left="425"/>
       </w:pPr>
       <w:r>
-        <w:t>- 22TCN 260-2000 - Quy trình khảo sát địa chất công trình cầu đường bộ;</w:t>
+        <w:t>- TCCS 41:2022/TCĐBVN - Tiêu chuẩn khảo sát, thiết kế nền đường ô tô đắp trên nền đất yếu;</w:t>
       </w:r>
     </w:p>
     <w:p>
@@ -375,7 +375,7 @@
         <w:ind w:left="425"/>
       </w:pPr>
       <w:r>
-        <w:t>- TCVN 9351:2012 - Thí nghiệm xuyên tiêu chuẩn (SPT);</w:t>
+        <w:t>- TCVN 9351:2022 - Thí nghiệm xuyên tiêu chuẩn (SPT);</w:t>
       </w:r>
     </w:p>
     <w:p>
@@ -718,7 +718,7 @@
           </w:tcPr>
           <w:p>
             <w:r>
-              <w:t>22TCN 263-2000</w:t>
+              <w:t>TCCS 31:2020/TCĐBVN</w:t>
             </w:r>
           </w:p>
         </w:tc>
@@ -770,7 +770,7 @@
           </w:tcPr>
           <w:p>
             <w:r>
-              <w:t>22TCN 263-2000</w:t>
+              <w:t>TCCS 31:2020/TCĐBVN</w:t>
             </w:r>
           </w:p>
         </w:tc>

</xml_diff>